<commit_message>
Se agregan nuevas etiquetas para configurar los documentos de soporte se agrega informacion a la BD  para el tema de contratacion
</commit_message>
<xml_diff>
--- a/back/src/static/todoSilver/Acuerdo de Confidencialidad .docx
+++ b/back/src/static/todoSilver/Acuerdo de Confidencialidad .docx
@@ -13727,87 +13727,7 @@
           <w:b/>
           <w:spacing w:val="-2"/>
         </w:rPr>
-        <w:t>23</w:t>
-      </w:r>
-      <w:r>
-        <w:rPr>
-          <w:rFonts w:ascii="Tahoma" w:hAnsi="Tahoma"/>
-          <w:b/>
-          <w:spacing w:val="-12"/>
-        </w:rPr>
-        <w:t xml:space="preserve"> </w:t>
-      </w:r>
-      <w:r>
-        <w:rPr>
-          <w:rFonts w:ascii="Tahoma" w:hAnsi="Tahoma"/>
-          <w:b/>
-          <w:spacing w:val="-2"/>
-        </w:rPr>
-        <w:t>del</w:t>
-      </w:r>
-      <w:r>
-        <w:rPr>
-          <w:rFonts w:ascii="Tahoma" w:hAnsi="Tahoma"/>
-          <w:b/>
-          <w:spacing w:val="-5"/>
-        </w:rPr>
-        <w:t xml:space="preserve"> </w:t>
-      </w:r>
-      <w:r>
-        <w:rPr>
-          <w:rFonts w:ascii="Tahoma" w:hAnsi="Tahoma"/>
-          <w:b/>
-          <w:spacing w:val="-2"/>
-        </w:rPr>
-        <w:t>mes</w:t>
-      </w:r>
-      <w:r>
-        <w:rPr>
-          <w:rFonts w:ascii="Tahoma" w:hAnsi="Tahoma"/>
-          <w:b/>
-          <w:spacing w:val="-6"/>
-        </w:rPr>
-        <w:t xml:space="preserve"> </w:t>
-      </w:r>
-      <w:r>
-        <w:rPr>
-          <w:rFonts w:ascii="Tahoma" w:hAnsi="Tahoma"/>
-          <w:b/>
-          <w:spacing w:val="-2"/>
-        </w:rPr>
-        <w:t>de</w:t>
-      </w:r>
-      <w:r>
-        <w:rPr>
-          <w:rFonts w:ascii="Tahoma" w:hAnsi="Tahoma"/>
-          <w:b/>
-          <w:spacing w:val="-9"/>
-        </w:rPr>
-        <w:t xml:space="preserve"> </w:t>
-      </w:r>
-      <w:r>
-        <w:rPr>
-          <w:rFonts w:ascii="Tahoma" w:hAnsi="Tahoma"/>
-          <w:b/>
-          <w:spacing w:val="-2"/>
-        </w:rPr>
-        <w:t>marzo</w:t>
-      </w:r>
-      <w:r>
-        <w:rPr>
-          <w:rFonts w:ascii="Tahoma" w:hAnsi="Tahoma"/>
-          <w:b/>
-          <w:spacing w:val="-8"/>
-        </w:rPr>
-        <w:t xml:space="preserve"> </w:t>
-      </w:r>
-      <w:r>
-        <w:rPr>
-          <w:rFonts w:ascii="Tahoma" w:hAnsi="Tahoma"/>
-          <w:b/>
-          <w:spacing w:val="-4"/>
-        </w:rPr>
-        <w:t>2026</w:t>
+        <w:t>{{FechaInicioContrato}}</w:t>
       </w:r>
     </w:p>
     <w:p>
@@ -16185,6 +16105,7 @@
   <w:style w:type="character" w:default="1" w:styleId="Fuentedeprrafopredeter">
     <w:name w:val="Default Paragraph Font"/>
     <w:uiPriority w:val="1"/>
+    <w:semiHidden/>
     <w:unhideWhenUsed/>
   </w:style>
   <w:style w:type="table" w:default="1" w:styleId="Tablanormal">

</xml_diff>